<commit_message>
Update Solution File for Exercise 3: Correct AWS service navigation and add new task image
</commit_message>
<xml_diff>
--- a/Hands-on Exercises/Exercise 3/Solution File Exercise 3.docx
+++ b/Hands-on Exercises/Exercise 3/Solution File Exercise 3.docx
@@ -99,10 +99,70 @@
         </w:numPr>
       </w:pPr>
       <w:r>
-        <w:t>Navigate to the EC2 Service</w:t>
+        <w:lastRenderedPageBreak/>
+        <w:t xml:space="preserve">Navigate to the </w:t>
+      </w:r>
+      <w:r>
+        <w:t>IAM</w:t>
+      </w:r>
+      <w:bookmarkStart w:id="0" w:name="_GoBack"/>
+      <w:bookmarkEnd w:id="0"/>
+      <w:r>
+        <w:t xml:space="preserve"> Service</w:t>
       </w:r>
       <w:r>
         <w:t>:</w:t>
+      </w:r>
+    </w:p>
+    <w:p>
+      <w:pPr>
+        <w:jc w:val="center"/>
+      </w:pPr>
+      <w:r>
+        <w:rPr>
+          <w:noProof/>
+        </w:rPr>
+        <w:drawing>
+          <wp:inline distT="0" distB="0" distL="0" distR="0">
+            <wp:extent cx="6455410" cy="4610735"/>
+            <wp:effectExtent l="0" t="0" r="2540" b="0"/>
+            <wp:docPr id="15" name="Picture 15"/>
+            <wp:cNvGraphicFramePr>
+              <a:graphicFrameLocks xmlns:a="http://schemas.openxmlformats.org/drawingml/2006/main" noChangeAspect="1"/>
+            </wp:cNvGraphicFramePr>
+            <a:graphic xmlns:a="http://schemas.openxmlformats.org/drawingml/2006/main">
+              <a:graphicData uri="http://schemas.openxmlformats.org/drawingml/2006/picture">
+                <pic:pic xmlns:pic="http://schemas.openxmlformats.org/drawingml/2006/picture">
+                  <pic:nvPicPr>
+                    <pic:cNvPr id="15" name="step 2.png"/>
+                    <pic:cNvPicPr/>
+                  </pic:nvPicPr>
+                  <pic:blipFill>
+                    <a:blip r:embed="rId9">
+                      <a:extLst>
+                        <a:ext uri="{28A0092B-C50C-407E-A947-70E740481C1C}">
+                          <a14:useLocalDpi xmlns:a14="http://schemas.microsoft.com/office/drawing/2010/main" val="0"/>
+                        </a:ext>
+                      </a:extLst>
+                    </a:blip>
+                    <a:stretch>
+                      <a:fillRect/>
+                    </a:stretch>
+                  </pic:blipFill>
+                  <pic:spPr>
+                    <a:xfrm>
+                      <a:off x="0" y="0"/>
+                      <a:ext cx="6455410" cy="4610735"/>
+                    </a:xfrm>
+                    <a:prstGeom prst="rect">
+                      <a:avLst/>
+                    </a:prstGeom>
+                  </pic:spPr>
+                </pic:pic>
+              </a:graphicData>
+            </a:graphic>
+          </wp:inline>
+        </w:drawing>
       </w:r>
     </w:p>
     <w:p>
@@ -136,12 +196,25 @@
           <w:sz w:val="35"/>
           <w:szCs w:val="28"/>
         </w:rPr>
-        <w:t>Click on Launch Instance:</w:t>
+        <w:t>Create a new IAM User (name it e.g., trainee-admin)</w:t>
+      </w:r>
+      <w:r>
+        <w:rPr>
+          <w:rFonts w:asciiTheme="majorHAnsi" w:eastAsiaTheme="majorEastAsia" w:hAnsiTheme="majorHAnsi" w:cstheme="majorBidi"/>
+          <w:b/>
+          <w:bCs/>
+          <w:color w:val="1F4E79"/>
+          <w:sz w:val="35"/>
+          <w:szCs w:val="28"/>
+        </w:rPr>
+        <w:t>:</w:t>
       </w:r>
     </w:p>
     <w:p>
       <w:pPr>
         <w:spacing w:before="100" w:after="60"/>
+        <w:ind w:left="360"/>
+        <w:jc w:val="center"/>
         <w:rPr>
           <w:rFonts w:asciiTheme="majorHAnsi" w:eastAsiaTheme="majorEastAsia" w:hAnsiTheme="majorHAnsi" w:cstheme="majorBidi"/>
           <w:b/>
@@ -346,6 +419,7 @@
           <w:sz w:val="35"/>
           <w:szCs w:val="28"/>
         </w:rPr>
+        <w:lastRenderedPageBreak/>
         <w:t>Under Network settings, allow SSH traffic from My IP:</w:t>
       </w:r>
     </w:p>
@@ -509,12 +583,10 @@
           <w:szCs w:val="28"/>
         </w:rPr>
       </w:pPr>
-      <w:bookmarkStart w:id="0" w:name="_GoBack"/>
-      <w:bookmarkEnd w:id="0"/>
     </w:p>
     <w:sectPr>
-      <w:headerReference w:type="default" r:id="rId9"/>
-      <w:footerReference w:type="default" r:id="rId10"/>
+      <w:headerReference w:type="default" r:id="rId10"/>
+      <w:footerReference w:type="default" r:id="rId11"/>
       <w:pgSz w:w="12240" w:h="15840"/>
       <w:pgMar w:top="893" w:right="1037" w:bottom="835" w:left="1037" w:header="720" w:footer="720" w:gutter="0"/>
       <w:cols w:space="720"/>
@@ -590,7 +662,7 @@
         <w:color w:val="757575"/>
         <w:sz w:val="16"/>
       </w:rPr>
-      <w:t>1</w:t>
+      <w:t>2</w:t>
     </w:r>
     <w:r>
       <w:rPr>
@@ -12522,6 +12594,17 @@
       <w:sz w:val="23"/>
     </w:rPr>
   </w:style>
+  <w:style w:type="character" w:styleId="Hyperlink">
+    <w:name w:val="Hyperlink"/>
+    <w:basedOn w:val="DefaultParagraphFont"/>
+    <w:uiPriority w:val="99"/>
+    <w:unhideWhenUsed/>
+    <w:rsid w:val="00A04DF3"/>
+    <w:rPr>
+      <w:color w:val="0000FF" w:themeColor="hyperlink"/>
+      <w:u w:val="single"/>
+    </w:rPr>
+  </w:style>
 </w:styles>
 </file>
 
@@ -12850,7 +12933,7 @@
 </file>
 
 <file path=customXml/itemProps1.xml><?xml version="1.0" encoding="utf-8"?>
-<ds:datastoreItem xmlns:ds="http://schemas.openxmlformats.org/officeDocument/2006/customXml" ds:itemID="{86E4EFCD-9067-43DF-BC05-927ED989EECF}">
+<ds:datastoreItem xmlns:ds="http://schemas.openxmlformats.org/officeDocument/2006/customXml" ds:itemID="{7697909B-740E-4161-8E9E-A7856A721A10}">
   <ds:schemaRefs>
     <ds:schemaRef ds:uri="http://schemas.openxmlformats.org/officeDocument/2006/bibliography"/>
   </ds:schemaRefs>

</xml_diff>

<commit_message>
Update Exercise 3: Replace step 2 image with updated version
</commit_message>
<xml_diff>
--- a/Hands-on Exercises/Exercise 3/Solution File Exercise 3.docx
+++ b/Hands-on Exercises/Exercise 3/Solution File Exercise 3.docx
@@ -105,8 +105,6 @@
       <w:r>
         <w:t>IAM</w:t>
       </w:r>
-      <w:bookmarkStart w:id="0" w:name="_GoBack"/>
-      <w:bookmarkEnd w:id="0"/>
       <w:r>
         <w:t xml:space="preserve"> Service</w:t>
       </w:r>
@@ -118,15 +116,16 @@
       <w:pPr>
         <w:jc w:val="center"/>
       </w:pPr>
+      <w:bookmarkStart w:id="0" w:name="_GoBack"/>
       <w:r>
         <w:rPr>
           <w:noProof/>
         </w:rPr>
         <w:drawing>
           <wp:inline distT="0" distB="0" distL="0" distR="0">
-            <wp:extent cx="6455410" cy="4610735"/>
-            <wp:effectExtent l="0" t="0" r="2540" b="0"/>
-            <wp:docPr id="15" name="Picture 15"/>
+            <wp:extent cx="6455410" cy="3273425"/>
+            <wp:effectExtent l="0" t="0" r="2540" b="3175"/>
+            <wp:docPr id="16" name="Picture 16"/>
             <wp:cNvGraphicFramePr>
               <a:graphicFrameLocks xmlns:a="http://schemas.openxmlformats.org/drawingml/2006/main" noChangeAspect="1"/>
             </wp:cNvGraphicFramePr>
@@ -134,7 +133,7 @@
               <a:graphicData uri="http://schemas.openxmlformats.org/drawingml/2006/picture">
                 <pic:pic xmlns:pic="http://schemas.openxmlformats.org/drawingml/2006/picture">
                   <pic:nvPicPr>
-                    <pic:cNvPr id="15" name="step 2.png"/>
+                    <pic:cNvPr id="16" name="step 2.png"/>
                     <pic:cNvPicPr/>
                   </pic:nvPicPr>
                   <pic:blipFill>
@@ -152,7 +151,7 @@
                   <pic:spPr>
                     <a:xfrm>
                       <a:off x="0" y="0"/>
-                      <a:ext cx="6455410" cy="4610735"/>
+                      <a:ext cx="6455410" cy="3273425"/>
                     </a:xfrm>
                     <a:prstGeom prst="rect">
                       <a:avLst/>
@@ -164,6 +163,7 @@
           </wp:inline>
         </w:drawing>
       </w:r>
+      <w:bookmarkEnd w:id="0"/>
     </w:p>
     <w:p>
       <w:r>
@@ -419,7 +419,6 @@
           <w:sz w:val="35"/>
           <w:szCs w:val="28"/>
         </w:rPr>
-        <w:lastRenderedPageBreak/>
         <w:t>Under Network settings, allow SSH traffic from My IP:</w:t>
       </w:r>
     </w:p>
@@ -526,6 +525,7 @@
           <w:sz w:val="35"/>
           <w:szCs w:val="28"/>
         </w:rPr>
+        <w:lastRenderedPageBreak/>
         <w:t>Review all settings and click Launch Instance:</w:t>
       </w:r>
     </w:p>
@@ -12933,7 +12933,7 @@
 </file>
 
 <file path=customXml/itemProps1.xml><?xml version="1.0" encoding="utf-8"?>
-<ds:datastoreItem xmlns:ds="http://schemas.openxmlformats.org/officeDocument/2006/customXml" ds:itemID="{7697909B-740E-4161-8E9E-A7856A721A10}">
+<ds:datastoreItem xmlns:ds="http://schemas.openxmlformats.org/officeDocument/2006/customXml" ds:itemID="{5DB7974D-0C0F-4828-84B6-CDB359231F8C}">
   <ds:schemaRefs>
     <ds:schemaRef ds:uri="http://schemas.openxmlformats.org/officeDocument/2006/bibliography"/>
   </ds:schemaRefs>

</xml_diff>

<commit_message>
Add temporary file for Exercise 3
</commit_message>
<xml_diff>
--- a/Hands-on Exercises/Exercise 3/Solution File Exercise 3.docx
+++ b/Hands-on Exercises/Exercise 3/Solution File Exercise 3.docx
@@ -116,7 +116,6 @@
       <w:pPr>
         <w:jc w:val="center"/>
       </w:pPr>
-      <w:bookmarkStart w:id="0" w:name="_GoBack"/>
       <w:r>
         <w:rPr>
           <w:noProof/>
@@ -163,7 +162,6 @@
           </wp:inline>
         </w:drawing>
       </w:r>
-      <w:bookmarkEnd w:id="0"/>
     </w:p>
     <w:p>
       <w:r>
@@ -213,6 +211,71 @@
     <w:p>
       <w:pPr>
         <w:spacing w:before="100" w:after="60"/>
+        <w:rPr>
+          <w:rFonts w:asciiTheme="majorHAnsi" w:eastAsiaTheme="majorEastAsia" w:hAnsiTheme="majorHAnsi" w:cstheme="majorBidi"/>
+          <w:b/>
+          <w:bCs/>
+          <w:color w:val="1F4E79"/>
+          <w:sz w:val="35"/>
+          <w:szCs w:val="28"/>
+        </w:rPr>
+      </w:pPr>
+      <w:r>
+        <w:rPr>
+          <w:rFonts w:asciiTheme="majorHAnsi" w:eastAsiaTheme="majorEastAsia" w:hAnsiTheme="majorHAnsi" w:cstheme="majorBidi"/>
+          <w:b/>
+          <w:bCs/>
+          <w:noProof/>
+          <w:color w:val="1F4E79"/>
+          <w:sz w:val="35"/>
+          <w:szCs w:val="28"/>
+        </w:rPr>
+        <w:drawing>
+          <wp:inline distT="0" distB="0" distL="0" distR="0">
+            <wp:extent cx="6455410" cy="3227705"/>
+            <wp:effectExtent l="0" t="0" r="2540" b="0"/>
+            <wp:docPr id="18" name="Picture 18"/>
+            <wp:cNvGraphicFramePr>
+              <a:graphicFrameLocks xmlns:a="http://schemas.openxmlformats.org/drawingml/2006/main" noChangeAspect="1"/>
+            </wp:cNvGraphicFramePr>
+            <a:graphic xmlns:a="http://schemas.openxmlformats.org/drawingml/2006/main">
+              <a:graphicData uri="http://schemas.openxmlformats.org/drawingml/2006/picture">
+                <pic:pic xmlns:pic="http://schemas.openxmlformats.org/drawingml/2006/picture">
+                  <pic:nvPicPr>
+                    <pic:cNvPr id="18" name="step 3.png"/>
+                    <pic:cNvPicPr/>
+                  </pic:nvPicPr>
+                  <pic:blipFill>
+                    <a:blip r:embed="rId10">
+                      <a:extLst>
+                        <a:ext uri="{28A0092B-C50C-407E-A947-70E740481C1C}">
+                          <a14:useLocalDpi xmlns:a14="http://schemas.microsoft.com/office/drawing/2010/main" val="0"/>
+                        </a:ext>
+                      </a:extLst>
+                    </a:blip>
+                    <a:stretch>
+                      <a:fillRect/>
+                    </a:stretch>
+                  </pic:blipFill>
+                  <pic:spPr>
+                    <a:xfrm>
+                      <a:off x="0" y="0"/>
+                      <a:ext cx="6455410" cy="3227705"/>
+                    </a:xfrm>
+                    <a:prstGeom prst="rect">
+                      <a:avLst/>
+                    </a:prstGeom>
+                  </pic:spPr>
+                </pic:pic>
+              </a:graphicData>
+            </a:graphic>
+          </wp:inline>
+        </w:drawing>
+      </w:r>
+    </w:p>
+    <w:p>
+      <w:pPr>
+        <w:spacing w:before="100" w:after="60"/>
         <w:ind w:left="360"/>
         <w:jc w:val="center"/>
         <w:rPr>
@@ -224,6 +287,17 @@
           <w:szCs w:val="28"/>
         </w:rPr>
       </w:pPr>
+      <w:r>
+        <w:rPr>
+          <w:rFonts w:asciiTheme="majorHAnsi" w:eastAsiaTheme="majorEastAsia" w:hAnsiTheme="majorHAnsi" w:cstheme="majorBidi"/>
+          <w:b/>
+          <w:bCs/>
+          <w:color w:val="1F4E79"/>
+          <w:sz w:val="35"/>
+          <w:szCs w:val="28"/>
+        </w:rPr>
+        <w:br w:type="column"/>
+      </w:r>
     </w:p>
     <w:p>
       <w:pPr>
@@ -251,7 +325,85 @@
           <w:sz w:val="35"/>
           <w:szCs w:val="28"/>
         </w:rPr>
-        <w:t xml:space="preserve">Give your instance a name: </w:t>
+        <w:t>Enable AWS Management Console Access for the User and set a Custom password</w:t>
+      </w:r>
+      <w:r>
+        <w:rPr>
+          <w:rFonts w:asciiTheme="majorHAnsi" w:eastAsiaTheme="majorEastAsia" w:hAnsiTheme="majorHAnsi" w:cstheme="majorBidi"/>
+          <w:b/>
+          <w:bCs/>
+          <w:color w:val="1F4E79"/>
+          <w:sz w:val="35"/>
+          <w:szCs w:val="28"/>
+        </w:rPr>
+        <w:t xml:space="preserve">: </w:t>
+      </w:r>
+    </w:p>
+    <w:p>
+      <w:pPr>
+        <w:spacing w:before="100" w:after="60"/>
+        <w:ind w:left="360"/>
+        <w:jc w:val="center"/>
+        <w:rPr>
+          <w:rFonts w:asciiTheme="majorHAnsi" w:eastAsiaTheme="majorEastAsia" w:hAnsiTheme="majorHAnsi" w:cstheme="majorBidi"/>
+          <w:b/>
+          <w:bCs/>
+          <w:color w:val="1F4E79"/>
+          <w:sz w:val="35"/>
+          <w:szCs w:val="28"/>
+        </w:rPr>
+      </w:pPr>
+      <w:r>
+        <w:rPr>
+          <w:rFonts w:asciiTheme="majorHAnsi" w:eastAsiaTheme="majorEastAsia" w:hAnsiTheme="majorHAnsi" w:cstheme="majorBidi"/>
+          <w:b/>
+          <w:bCs/>
+          <w:noProof/>
+          <w:color w:val="1F4E79"/>
+          <w:sz w:val="35"/>
+          <w:szCs w:val="28"/>
+        </w:rPr>
+        <w:drawing>
+          <wp:inline distT="0" distB="0" distL="0" distR="0">
+            <wp:extent cx="6455410" cy="3260725"/>
+            <wp:effectExtent l="0" t="0" r="2540" b="0"/>
+            <wp:docPr id="20" name="Picture 20"/>
+            <wp:cNvGraphicFramePr>
+              <a:graphicFrameLocks xmlns:a="http://schemas.openxmlformats.org/drawingml/2006/main" noChangeAspect="1"/>
+            </wp:cNvGraphicFramePr>
+            <a:graphic xmlns:a="http://schemas.openxmlformats.org/drawingml/2006/main">
+              <a:graphicData uri="http://schemas.openxmlformats.org/drawingml/2006/picture">
+                <pic:pic xmlns:pic="http://schemas.openxmlformats.org/drawingml/2006/picture">
+                  <pic:nvPicPr>
+                    <pic:cNvPr id="20" name="2. step 3.png"/>
+                    <pic:cNvPicPr/>
+                  </pic:nvPicPr>
+                  <pic:blipFill>
+                    <a:blip r:embed="rId11">
+                      <a:extLst>
+                        <a:ext uri="{28A0092B-C50C-407E-A947-70E740481C1C}">
+                          <a14:useLocalDpi xmlns:a14="http://schemas.microsoft.com/office/drawing/2010/main" val="0"/>
+                        </a:ext>
+                      </a:extLst>
+                    </a:blip>
+                    <a:stretch>
+                      <a:fillRect/>
+                    </a:stretch>
+                  </pic:blipFill>
+                  <pic:spPr>
+                    <a:xfrm>
+                      <a:off x="0" y="0"/>
+                      <a:ext cx="6455410" cy="3260725"/>
+                    </a:xfrm>
+                    <a:prstGeom prst="rect">
+                      <a:avLst/>
+                    </a:prstGeom>
+                  </pic:spPr>
+                </pic:pic>
+              </a:graphicData>
+            </a:graphic>
+          </wp:inline>
+        </w:drawing>
       </w:r>
     </w:p>
     <w:p>
@@ -293,8 +445,77 @@
           <w:sz w:val="35"/>
           <w:szCs w:val="28"/>
         </w:rPr>
-        <w:t>Select a Free Tier eligible AMI</w:t>
+        <w:t>Review and Create the user:</w:t>
       </w:r>
+    </w:p>
+    <w:p>
+      <w:pPr>
+        <w:spacing w:before="100" w:after="60"/>
+        <w:ind w:left="360"/>
+        <w:jc w:val="center"/>
+        <w:rPr>
+          <w:rFonts w:asciiTheme="majorHAnsi" w:eastAsiaTheme="majorEastAsia" w:hAnsiTheme="majorHAnsi" w:cstheme="majorBidi"/>
+          <w:b/>
+          <w:bCs/>
+          <w:color w:val="1F4E79"/>
+          <w:sz w:val="35"/>
+          <w:szCs w:val="28"/>
+        </w:rPr>
+      </w:pPr>
+      <w:bookmarkStart w:id="0" w:name="_GoBack"/>
+      <w:r>
+        <w:rPr>
+          <w:rFonts w:asciiTheme="majorHAnsi" w:eastAsiaTheme="majorEastAsia" w:hAnsiTheme="majorHAnsi" w:cstheme="majorBidi"/>
+          <w:b/>
+          <w:bCs/>
+          <w:noProof/>
+          <w:color w:val="1F4E79"/>
+          <w:sz w:val="35"/>
+          <w:szCs w:val="28"/>
+        </w:rPr>
+        <w:drawing>
+          <wp:inline distT="0" distB="0" distL="0" distR="0">
+            <wp:extent cx="6455410" cy="3266440"/>
+            <wp:effectExtent l="0" t="0" r="2540" b="0"/>
+            <wp:docPr id="21" name="Picture 21"/>
+            <wp:cNvGraphicFramePr>
+              <a:graphicFrameLocks xmlns:a="http://schemas.openxmlformats.org/drawingml/2006/main" noChangeAspect="1"/>
+            </wp:cNvGraphicFramePr>
+            <a:graphic xmlns:a="http://schemas.openxmlformats.org/drawingml/2006/main">
+              <a:graphicData uri="http://schemas.openxmlformats.org/drawingml/2006/picture">
+                <pic:pic xmlns:pic="http://schemas.openxmlformats.org/drawingml/2006/picture">
+                  <pic:nvPicPr>
+                    <pic:cNvPr id="21" name="step 5.png"/>
+                    <pic:cNvPicPr/>
+                  </pic:nvPicPr>
+                  <pic:blipFill>
+                    <a:blip r:embed="rId12">
+                      <a:extLst>
+                        <a:ext uri="{28A0092B-C50C-407E-A947-70E740481C1C}">
+                          <a14:useLocalDpi xmlns:a14="http://schemas.microsoft.com/office/drawing/2010/main" val="0"/>
+                        </a:ext>
+                      </a:extLst>
+                    </a:blip>
+                    <a:stretch>
+                      <a:fillRect/>
+                    </a:stretch>
+                  </pic:blipFill>
+                  <pic:spPr>
+                    <a:xfrm>
+                      <a:off x="0" y="0"/>
+                      <a:ext cx="6455410" cy="3266440"/>
+                    </a:xfrm>
+                    <a:prstGeom prst="rect">
+                      <a:avLst/>
+                    </a:prstGeom>
+                  </pic:spPr>
+                </pic:pic>
+              </a:graphicData>
+            </a:graphic>
+          </wp:inline>
+        </w:drawing>
+      </w:r>
+      <w:bookmarkEnd w:id="0"/>
     </w:p>
     <w:p>
       <w:pPr>
@@ -335,6 +556,7 @@
           <w:sz w:val="35"/>
           <w:szCs w:val="28"/>
         </w:rPr>
+        <w:lastRenderedPageBreak/>
         <w:t xml:space="preserve">Choose the Free Tier eligible instance type: t2.micro or t3.micro: </w:t>
       </w:r>
     </w:p>
@@ -525,7 +747,6 @@
           <w:sz w:val="35"/>
           <w:szCs w:val="28"/>
         </w:rPr>
-        <w:lastRenderedPageBreak/>
         <w:t>Review all settings and click Launch Instance:</w:t>
       </w:r>
     </w:p>
@@ -585,8 +806,8 @@
       </w:pPr>
     </w:p>
     <w:sectPr>
-      <w:headerReference w:type="default" r:id="rId10"/>
-      <w:footerReference w:type="default" r:id="rId11"/>
+      <w:headerReference w:type="default" r:id="rId13"/>
+      <w:footerReference w:type="default" r:id="rId14"/>
       <w:pgSz w:w="12240" w:h="15840"/>
       <w:pgMar w:top="893" w:right="1037" w:bottom="835" w:left="1037" w:header="720" w:footer="720" w:gutter="0"/>
       <w:cols w:space="720"/>
@@ -662,7 +883,7 @@
         <w:color w:val="757575"/>
         <w:sz w:val="16"/>
       </w:rPr>
-      <w:t>2</w:t>
+      <w:t>4</w:t>
     </w:r>
     <w:r>
       <w:rPr>
@@ -12933,7 +13154,7 @@
 </file>
 
 <file path=customXml/itemProps1.xml><?xml version="1.0" encoding="utf-8"?>
-<ds:datastoreItem xmlns:ds="http://schemas.openxmlformats.org/officeDocument/2006/customXml" ds:itemID="{5DB7974D-0C0F-4828-84B6-CDB359231F8C}">
+<ds:datastoreItem xmlns:ds="http://schemas.openxmlformats.org/officeDocument/2006/customXml" ds:itemID="{EF96D271-69DA-4DE7-BB0D-7EF6527E2652}">
   <ds:schemaRefs>
     <ds:schemaRef ds:uri="http://schemas.openxmlformats.org/officeDocument/2006/bibliography"/>
   </ds:schemaRefs>

</xml_diff>

<commit_message>
Update Solution File for Exercise 3: Add sign-out instruction from root account
</commit_message>
<xml_diff>
--- a/Hands-on Exercises/Exercise 3/Solution File Exercise 3.docx
+++ b/Hands-on Exercises/Exercise 3/Solution File Exercise 3.docx
@@ -462,7 +462,6 @@
           <w:szCs w:val="28"/>
         </w:rPr>
       </w:pPr>
-      <w:bookmarkStart w:id="0" w:name="_GoBack"/>
       <w:r>
         <w:rPr>
           <w:rFonts w:asciiTheme="majorHAnsi" w:eastAsiaTheme="majorEastAsia" w:hAnsiTheme="majorHAnsi" w:cstheme="majorBidi"/>
@@ -515,7 +514,6 @@
           </wp:inline>
         </w:drawing>
       </w:r>
-      <w:bookmarkEnd w:id="0"/>
     </w:p>
     <w:p>
       <w:pPr>
@@ -557,8 +555,36 @@
           <w:szCs w:val="28"/>
         </w:rPr>
         <w:lastRenderedPageBreak/>
-        <w:t xml:space="preserve">Choose the Free Tier eligible instance type: t2.micro or t3.micro: </w:t>
+        <w:t>Sign out from the root account</w:t>
       </w:r>
+      <w:r>
+        <w:rPr>
+          <w:rFonts w:asciiTheme="majorHAnsi" w:eastAsiaTheme="majorEastAsia" w:hAnsiTheme="majorHAnsi" w:cstheme="majorBidi"/>
+          <w:b/>
+          <w:bCs/>
+          <w:color w:val="1F4E79"/>
+          <w:sz w:val="35"/>
+          <w:szCs w:val="28"/>
+        </w:rPr>
+        <w:t>:</w:t>
+      </w:r>
+    </w:p>
+    <w:p>
+      <w:pPr>
+        <w:spacing w:before="100" w:after="60"/>
+        <w:ind w:left="360"/>
+        <w:jc w:val="center"/>
+        <w:rPr>
+          <w:rFonts w:asciiTheme="majorHAnsi" w:eastAsiaTheme="majorEastAsia" w:hAnsiTheme="majorHAnsi" w:cstheme="majorBidi"/>
+          <w:b/>
+          <w:bCs/>
+          <w:color w:val="1F4E79"/>
+          <w:sz w:val="35"/>
+          <w:szCs w:val="28"/>
+        </w:rPr>
+      </w:pPr>
+      <w:bookmarkStart w:id="0" w:name="_GoBack"/>
+      <w:bookmarkEnd w:id="0"/>
     </w:p>
     <w:p>
       <w:pPr>
@@ -13154,7 +13180,7 @@
 </file>
 
 <file path=customXml/itemProps1.xml><?xml version="1.0" encoding="utf-8"?>
-<ds:datastoreItem xmlns:ds="http://schemas.openxmlformats.org/officeDocument/2006/customXml" ds:itemID="{EF96D271-69DA-4DE7-BB0D-7EF6527E2652}">
+<ds:datastoreItem xmlns:ds="http://schemas.openxmlformats.org/officeDocument/2006/customXml" ds:itemID="{3F2F2687-0FF2-4789-99EA-95B65424E3A0}">
   <ds:schemaRefs>
     <ds:schemaRef ds:uri="http://schemas.openxmlformats.org/officeDocument/2006/bibliography"/>
   </ds:schemaRefs>

</xml_diff>